<commit_message>
docs: update UI guide screenshots and annotation configs
Co-Authored-By: Claude Opus 4.6 <noreply@anthropic.com>
</commit_message>
<xml_diff>
--- a/rag-local/docs/guide/revision_ops/ops_ui_guide.docx
+++ b/rag-local/docs/guide/revision_ops/ops_ui_guide.docx
@@ -4683,78 +4683,20 @@
           </w:p>
         </w:tc>
       </w:tr>
-      <w:tr>
-        <w:tc>
-          <w:tcPr>
-            <w:tcW w:type="dxa" w:w="600"/>
-            <w:tcBorders>
-              <w:top w:val="single" w:color="CCCCCC" w:sz="1"/>
-              <w:left w:val="single" w:color="CCCCCC" w:sz="1"/>
-              <w:bottom w:val="single" w:color="CCCCCC" w:sz="1"/>
-              <w:right w:val="single" w:color="CCCCCC" w:sz="1"/>
-            </w:tcBorders>
-          </w:tcPr>
-          <w:p>
-            <w:pPr>
-              <w:jc w:val="center"/>
-            </w:pPr>
-            <w:r>
-              <w:rPr>
-                <w:color w:val="DC3232"/>
-                <w:sz w:val="20"/>
-                <w:szCs w:val="20"/>
-                <w:rFonts w:ascii="Meiryo UI" w:cs="Meiryo UI" w:eastAsia="Meiryo UI" w:hAnsi="Meiryo UI"/>
-              </w:rPr>
-              <w:t xml:space="preserve">②</w:t>
-            </w:r>
-          </w:p>
-        </w:tc>
-        <w:tc>
-          <w:tcPr>
-            <w:tcW w:type="dxa" w:w="2400"/>
-            <w:tcBorders>
-              <w:top w:val="single" w:color="CCCCCC" w:sz="1"/>
-              <w:left w:val="single" w:color="CCCCCC" w:sz="1"/>
-              <w:bottom w:val="single" w:color="CCCCCC" w:sz="1"/>
-              <w:right w:val="single" w:color="CCCCCC" w:sz="1"/>
-            </w:tcBorders>
-          </w:tcPr>
-          <w:p>
-            <w:r>
-              <w:rPr>
-                <w:b/>
-                <w:bCs/>
-                <w:sz w:val="20"/>
-                <w:szCs w:val="20"/>
-                <w:rFonts w:ascii="Meiryo UI" w:cs="Meiryo UI" w:eastAsia="Meiryo UI" w:hAnsi="Meiryo UI"/>
-              </w:rPr>
-              <w:t xml:space="preserve">全件返却キャプション</w:t>
-            </w:r>
-          </w:p>
-        </w:tc>
-        <w:tc>
-          <w:tcPr>
-            <w:tcW w:type="dxa" w:w="6000"/>
-            <w:tcBorders>
-              <w:top w:val="single" w:color="CCCCCC" w:sz="1"/>
-              <w:left w:val="single" w:color="CCCCCC" w:sz="1"/>
-              <w:bottom w:val="single" w:color="CCCCCC" w:sz="1"/>
-              <w:right w:val="single" w:color="CCCCCC" w:sz="1"/>
-            </w:tcBorders>
-          </w:tcPr>
-          <w:p>
-            <w:r>
-              <w:rPr>
-                <w:sz w:val="20"/>
-                <w:szCs w:val="20"/>
-                <w:rFonts w:ascii="Meiryo UI" w:cs="Meiryo UI" w:eastAsia="Meiryo UI" w:hAnsi="Meiryo UI"/>
-              </w:rPr>
-              <w:t xml:space="preserve">キーワード検索ではマッチする全件が返却されます。候補数の設定は適用されません。用語の単純な置き換え（例: 改定⑤「AMLフィルター」→「GPLEX」）の検出に適しています。</w:t>
-            </w:r>
-          </w:p>
-        </w:tc>
-      </w:tr>
     </w:tbl>
+    <w:p>
+      <w:pPr>
+        <w:spacing w:after="120"/>
+      </w:pPr>
+      <w:r>
+        <w:rPr>
+          <w:sz w:val="21"/>
+          <w:szCs w:val="21"/>
+          <w:rFonts w:ascii="Meiryo UI" w:cs="Meiryo UI" w:eastAsia="Meiryo UI" w:hAnsi="Meiryo UI"/>
+        </w:rPr>
+        <w:t xml:space="preserve">キーワード検索ではマッチする全件が返却されます。候補数の設定は適用されません。用語の単純な置き換え（例: 改定⑤「AMLフィルター」→「GPLEX」）の検出に適しています。</w:t>
+      </w:r>
+    </w:p>
     <w:p>
       <w:pPr>
         <w:pStyle w:val="Heading1"/>

</xml_diff>